<commit_message>
Updated report with repository link
</commit_message>
<xml_diff>
--- a/docs/Leave_Management_System_Report.docx
+++ b/docs/Leave_Management_System_Report.docx
@@ -511,6 +511,65 @@
                 <w:sz w:val="20"/>
                 <w:szCs w:val="20"/>
               </w:rPr>
+              <w:t xml:space="preserve">Git commit history</w:t>
+            </w:r>
+          </w:p>
+        </w:tc>
+        <w:tc>
+          <w:tcPr>
+            <w:tcW w:type="dxa" w:w="6300"/>
+            <w:tcMar>
+              <w:top w:type="dxa" w:w="70"/>
+              <w:left w:type="dxa" w:w="110"/>
+              <w:bottom w:type="dxa" w:w="70"/>
+              <w:right w:type="dxa" w:w="110"/>
+            </w:tcMar>
+          </w:tcPr>
+          <w:p>
+            <w:pPr>
+              <w:keepNext/>
+              <w:spacing w:after="0" w:line="250"/>
+            </w:pPr>
+            <w:r>
+              <w:rPr>
+                <w:rFonts w:ascii="Calibri" w:cs="Calibri" w:eastAsia="Calibri" w:hAnsi="Calibri"/>
+                <w:b w:val="false"/>
+                <w:bCs w:val="false"/>
+                <w:sz w:val="20"/>
+                <w:szCs w:val="20"/>
+              </w:rPr>
+              <w:t xml:space="preserve">Section 11 and the commit history on GitHub</w:t>
+            </w:r>
+          </w:p>
+        </w:tc>
+      </w:tr>
+      <w:tr>
+        <w:trPr>
+          <w:cantSplit/>
+        </w:trPr>
+        <w:tc>
+          <w:tcPr>
+            <w:tcW w:type="dxa" w:w="3200"/>
+            <w:tcMar>
+              <w:top w:type="dxa" w:w="70"/>
+              <w:left w:type="dxa" w:w="110"/>
+              <w:bottom w:type="dxa" w:w="70"/>
+              <w:right w:type="dxa" w:w="110"/>
+            </w:tcMar>
+          </w:tcPr>
+          <w:p>
+            <w:pPr>
+              <w:keepNext/>
+              <w:spacing w:after="0" w:line="250"/>
+            </w:pPr>
+            <w:r>
+              <w:rPr>
+                <w:rFonts w:ascii="Calibri" w:cs="Calibri" w:eastAsia="Calibri" w:hAnsi="Calibri"/>
+                <w:b/>
+                <w:bCs/>
+                <w:sz w:val="20"/>
+                <w:szCs w:val="20"/>
+              </w:rPr>
               <w:t xml:space="preserve">Explanation of OOP concepts used</w:t>
             </w:r>
           </w:p>
@@ -635,28 +694,30 @@
         </w:rPr>
         <w:t xml:space="preserve">Repository link: </w:t>
       </w:r>
+      <w:hyperlink w:history="1" r:id="rIdpwzkmp6rvpwyo7h0vhp3h">
+        <w:r>
+          <w:rPr>
+            <w:rFonts w:ascii="Calibri" w:cs="Calibri" w:eastAsia="Calibri" w:hAnsi="Calibri"/>
+            <w:color w:val="0563C1"/>
+            <w:sz w:val="22"/>
+            <w:szCs w:val="22"/>
+            <w:u w:val="single"/>
+          </w:rPr>
+          <w:t xml:space="preserve">https://github.com/Hrishithaprasad/leave-management-system</w:t>
+        </w:r>
+      </w:hyperlink>
+    </w:p>
+    <w:p>
+      <w:pPr>
+        <w:spacing w:after="150" w:line="276"/>
+      </w:pPr>
       <w:r>
         <w:rPr>
           <w:rFonts w:ascii="Calibri" w:cs="Calibri" w:eastAsia="Calibri" w:hAnsi="Calibri"/>
           <w:sz w:val="22"/>
           <w:szCs w:val="22"/>
-          <w:highlight w:val="yellow"/>
-          <w:highlightCs w:val="yellow"/>
-        </w:rPr>
-        <w:t xml:space="preserve">[Paste your GitHub repository link here]</w:t>
-      </w:r>
-    </w:p>
-    <w:p>
-      <w:pPr>
-        <w:spacing w:after="150" w:line="276"/>
-      </w:pPr>
-      <w:r>
-        <w:rPr>
-          <w:rFonts w:ascii="Calibri" w:cs="Calibri" w:eastAsia="Calibri" w:hAnsi="Calibri"/>
-          <w:sz w:val="22"/>
-          <w:szCs w:val="22"/>
-        </w:rPr>
-        <w:t xml:space="preserve">The repository contains the Java source code (src), the documentation and diagrams (docs) and the README file.</w:t>
+        </w:rPr>
+        <w:t xml:space="preserve">The repository is public. It contains the Java source code (src), the documentation and diagrams (docs) and the README file. The eight commits that show how the project was built are listed in Section 11.</w:t>
       </w:r>
     </w:p>
     <w:p>
@@ -8108,6 +8169,851 @@
       </w:r>
     </w:p>
     <w:p>
+      <w:pPr>
+        <w:pStyle w:val="Heading1"/>
+        <w:keepNext/>
+        <w:spacing w:after="140" w:before="300"/>
+      </w:pPr>
+      <w:r>
+        <w:rPr>
+          <w:rFonts w:ascii="Calibri" w:cs="Calibri" w:eastAsia="Calibri" w:hAnsi="Calibri"/>
+          <w:b/>
+          <w:bCs/>
+          <w:color w:val="1F3864"/>
+          <w:sz w:val="28"/>
+          <w:szCs w:val="28"/>
+        </w:rPr>
+        <w:t xml:space="preserve">11. Git Practice</w:t>
+      </w:r>
+    </w:p>
+    <w:p>
+      <w:pPr>
+        <w:spacing w:after="150" w:line="276"/>
+      </w:pPr>
+      <w:r>
+        <w:rPr>
+          <w:rFonts w:ascii="Calibri" w:cs="Calibri" w:eastAsia="Calibri" w:hAnsi="Calibri"/>
+          <w:sz w:val="22"/>
+          <w:szCs w:val="22"/>
+        </w:rPr>
+        <w:t xml:space="preserve">The project is maintained with Git and hosted on GitHub (link in Section 2). The history has eight commits, each adding one meaningful step, in the order the project was built. Each commit compiles and runs.</w:t>
+      </w:r>
+    </w:p>
+    <w:tbl>
+      <w:tblPr>
+        <w:tblW w:type="dxa" w:w="9500"/>
+        <w:tblBorders>
+          <w:top w:val="single" w:color="auto" w:sz="4"/>
+          <w:left w:val="single" w:color="auto" w:sz="4"/>
+          <w:bottom w:val="single" w:color="auto" w:sz="4"/>
+          <w:right w:val="single" w:color="auto" w:sz="4"/>
+          <w:insideH w:val="single" w:color="auto" w:sz="4"/>
+          <w:insideV w:val="single" w:color="auto" w:sz="4"/>
+        </w:tblBorders>
+      </w:tblPr>
+      <w:tblGrid>
+        <w:gridCol w:w="450"/>
+        <w:gridCol w:w="2800"/>
+        <w:gridCol w:w="6250"/>
+      </w:tblGrid>
+      <w:tr>
+        <w:trPr>
+          <w:cantSplit/>
+          <w:tblHeader/>
+        </w:trPr>
+        <w:tc>
+          <w:tcPr>
+            <w:tcW w:type="dxa" w:w="450"/>
+            <w:shd w:fill="D9E2F3" w:color="auto" w:val="clear"/>
+            <w:tcMar>
+              <w:top w:type="dxa" w:w="70"/>
+              <w:left w:type="dxa" w:w="110"/>
+              <w:bottom w:type="dxa" w:w="70"/>
+              <w:right w:type="dxa" w:w="110"/>
+            </w:tcMar>
+          </w:tcPr>
+          <w:p>
+            <w:pPr>
+              <w:keepNext/>
+              <w:spacing w:after="0" w:line="250"/>
+            </w:pPr>
+            <w:r>
+              <w:rPr>
+                <w:rFonts w:ascii="Calibri" w:cs="Calibri" w:eastAsia="Calibri" w:hAnsi="Calibri"/>
+                <w:b/>
+                <w:bCs/>
+                <w:sz w:val="20"/>
+                <w:szCs w:val="20"/>
+              </w:rPr>
+              <w:t xml:space="preserve">#</w:t>
+            </w:r>
+          </w:p>
+        </w:tc>
+        <w:tc>
+          <w:tcPr>
+            <w:tcW w:type="dxa" w:w="2800"/>
+            <w:shd w:fill="D9E2F3" w:color="auto" w:val="clear"/>
+            <w:tcMar>
+              <w:top w:type="dxa" w:w="70"/>
+              <w:left w:type="dxa" w:w="110"/>
+              <w:bottom w:type="dxa" w:w="70"/>
+              <w:right w:type="dxa" w:w="110"/>
+            </w:tcMar>
+          </w:tcPr>
+          <w:p>
+            <w:pPr>
+              <w:keepNext/>
+              <w:spacing w:after="0" w:line="250"/>
+            </w:pPr>
+            <w:r>
+              <w:rPr>
+                <w:rFonts w:ascii="Calibri" w:cs="Calibri" w:eastAsia="Calibri" w:hAnsi="Calibri"/>
+                <w:b/>
+                <w:bCs/>
+                <w:sz w:val="20"/>
+                <w:szCs w:val="20"/>
+              </w:rPr>
+              <w:t xml:space="preserve">Commit message</w:t>
+            </w:r>
+          </w:p>
+        </w:tc>
+        <w:tc>
+          <w:tcPr>
+            <w:tcW w:type="dxa" w:w="6250"/>
+            <w:shd w:fill="D9E2F3" w:color="auto" w:val="clear"/>
+            <w:tcMar>
+              <w:top w:type="dxa" w:w="70"/>
+              <w:left w:type="dxa" w:w="110"/>
+              <w:bottom w:type="dxa" w:w="70"/>
+              <w:right w:type="dxa" w:w="110"/>
+            </w:tcMar>
+          </w:tcPr>
+          <w:p>
+            <w:pPr>
+              <w:keepNext/>
+              <w:spacing w:after="0" w:line="250"/>
+            </w:pPr>
+            <w:r>
+              <w:rPr>
+                <w:rFonts w:ascii="Calibri" w:cs="Calibri" w:eastAsia="Calibri" w:hAnsi="Calibri"/>
+                <w:b/>
+                <w:bCs/>
+                <w:sz w:val="20"/>
+                <w:szCs w:val="20"/>
+              </w:rPr>
+              <w:t xml:space="preserve">What the commit contains</w:t>
+            </w:r>
+          </w:p>
+        </w:tc>
+      </w:tr>
+      <w:tr>
+        <w:trPr>
+          <w:cantSplit/>
+        </w:trPr>
+        <w:tc>
+          <w:tcPr>
+            <w:tcW w:type="dxa" w:w="450"/>
+            <w:tcMar>
+              <w:top w:type="dxa" w:w="70"/>
+              <w:left w:type="dxa" w:w="110"/>
+              <w:bottom w:type="dxa" w:w="70"/>
+              <w:right w:type="dxa" w:w="110"/>
+            </w:tcMar>
+          </w:tcPr>
+          <w:p>
+            <w:pPr>
+              <w:keepNext/>
+              <w:spacing w:after="0" w:line="250"/>
+            </w:pPr>
+            <w:r>
+              <w:rPr>
+                <w:rFonts w:ascii="Calibri" w:cs="Calibri" w:eastAsia="Calibri" w:hAnsi="Calibri"/>
+                <w:b/>
+                <w:bCs/>
+                <w:sz w:val="20"/>
+                <w:szCs w:val="20"/>
+              </w:rPr>
+              <w:t xml:space="preserve">1</w:t>
+            </w:r>
+          </w:p>
+        </w:tc>
+        <w:tc>
+          <w:tcPr>
+            <w:tcW w:type="dxa" w:w="2800"/>
+            <w:tcMar>
+              <w:top w:type="dxa" w:w="70"/>
+              <w:left w:type="dxa" w:w="110"/>
+              <w:bottom w:type="dxa" w:w="70"/>
+              <w:right w:type="dxa" w:w="110"/>
+            </w:tcMar>
+          </w:tcPr>
+          <w:p>
+            <w:pPr>
+              <w:keepNext/>
+              <w:spacing w:after="0" w:line="250"/>
+            </w:pPr>
+            <w:r>
+              <w:rPr>
+                <w:rFonts w:ascii="Calibri" w:cs="Calibri" w:eastAsia="Calibri" w:hAnsi="Calibri"/>
+                <w:b w:val="false"/>
+                <w:bCs w:val="false"/>
+                <w:sz w:val="20"/>
+                <w:szCs w:val="20"/>
+              </w:rPr>
+              <w:t xml:space="preserve">Initial employee design</w:t>
+            </w:r>
+          </w:p>
+        </w:tc>
+        <w:tc>
+          <w:tcPr>
+            <w:tcW w:type="dxa" w:w="6250"/>
+            <w:tcMar>
+              <w:top w:type="dxa" w:w="70"/>
+              <w:left w:type="dxa" w:w="110"/>
+              <w:bottom w:type="dxa" w:w="70"/>
+              <w:right w:type="dxa" w:w="110"/>
+            </w:tcMar>
+          </w:tcPr>
+          <w:p>
+            <w:pPr>
+              <w:keepNext/>
+              <w:spacing w:after="0" w:line="250"/>
+            </w:pPr>
+            <w:r>
+              <w:rPr>
+                <w:rFonts w:ascii="Calibri" w:cs="Calibri" w:eastAsia="Calibri" w:hAnsi="Calibri"/>
+                <w:b w:val="false"/>
+                <w:bCs w:val="false"/>
+                <w:sz w:val="20"/>
+                <w:szCs w:val="20"/>
+              </w:rPr>
+              <w:t xml:space="preserve">The .gitignore file and the class diagram drawn before any code was written</w:t>
+            </w:r>
+          </w:p>
+        </w:tc>
+      </w:tr>
+      <w:tr>
+        <w:trPr>
+          <w:cantSplit/>
+        </w:trPr>
+        <w:tc>
+          <w:tcPr>
+            <w:tcW w:type="dxa" w:w="450"/>
+            <w:tcMar>
+              <w:top w:type="dxa" w:w="70"/>
+              <w:left w:type="dxa" w:w="110"/>
+              <w:bottom w:type="dxa" w:w="70"/>
+              <w:right w:type="dxa" w:w="110"/>
+            </w:tcMar>
+          </w:tcPr>
+          <w:p>
+            <w:pPr>
+              <w:keepNext/>
+              <w:spacing w:after="0" w:line="250"/>
+            </w:pPr>
+            <w:r>
+              <w:rPr>
+                <w:rFonts w:ascii="Calibri" w:cs="Calibri" w:eastAsia="Calibri" w:hAnsi="Calibri"/>
+                <w:b/>
+                <w:bCs/>
+                <w:sz w:val="20"/>
+                <w:szCs w:val="20"/>
+              </w:rPr>
+              <w:t xml:space="preserve">2</w:t>
+            </w:r>
+          </w:p>
+        </w:tc>
+        <w:tc>
+          <w:tcPr>
+            <w:tcW w:type="dxa" w:w="2800"/>
+            <w:tcMar>
+              <w:top w:type="dxa" w:w="70"/>
+              <w:left w:type="dxa" w:w="110"/>
+              <w:bottom w:type="dxa" w:w="70"/>
+              <w:right w:type="dxa" w:w="110"/>
+            </w:tcMar>
+          </w:tcPr>
+          <w:p>
+            <w:pPr>
+              <w:keepNext/>
+              <w:spacing w:after="0" w:line="250"/>
+            </w:pPr>
+            <w:r>
+              <w:rPr>
+                <w:rFonts w:ascii="Calibri" w:cs="Calibri" w:eastAsia="Calibri" w:hAnsi="Calibri"/>
+                <w:b w:val="false"/>
+                <w:bCs w:val="false"/>
+                <w:sz w:val="20"/>
+                <w:szCs w:val="20"/>
+              </w:rPr>
+              <w:t xml:space="preserve">Added Employee class</w:t>
+            </w:r>
+          </w:p>
+        </w:tc>
+        <w:tc>
+          <w:tcPr>
+            <w:tcW w:type="dxa" w:w="6250"/>
+            <w:tcMar>
+              <w:top w:type="dxa" w:w="70"/>
+              <w:left w:type="dxa" w:w="110"/>
+              <w:bottom w:type="dxa" w:w="70"/>
+              <w:right w:type="dxa" w:w="110"/>
+            </w:tcMar>
+          </w:tcPr>
+          <w:p>
+            <w:pPr>
+              <w:keepNext/>
+              <w:spacing w:after="0" w:line="250"/>
+            </w:pPr>
+            <w:r>
+              <w:rPr>
+                <w:rFonts w:ascii="Calibri" w:cs="Calibri" w:eastAsia="Calibri" w:hAnsi="Calibri"/>
+                <w:b w:val="false"/>
+                <w:bCs w:val="false"/>
+                <w:sz w:val="20"/>
+                <w:szCs w:val="20"/>
+              </w:rPr>
+              <w:t xml:space="preserve">The Employee class with its data and displayDetails(); the app creates three employees</w:t>
+            </w:r>
+          </w:p>
+        </w:tc>
+      </w:tr>
+      <w:tr>
+        <w:trPr>
+          <w:cantSplit/>
+        </w:trPr>
+        <w:tc>
+          <w:tcPr>
+            <w:tcW w:type="dxa" w:w="450"/>
+            <w:tcMar>
+              <w:top w:type="dxa" w:w="70"/>
+              <w:left w:type="dxa" w:w="110"/>
+              <w:bottom w:type="dxa" w:w="70"/>
+              <w:right w:type="dxa" w:w="110"/>
+            </w:tcMar>
+          </w:tcPr>
+          <w:p>
+            <w:pPr>
+              <w:keepNext/>
+              <w:spacing w:after="0" w:line="250"/>
+            </w:pPr>
+            <w:r>
+              <w:rPr>
+                <w:rFonts w:ascii="Calibri" w:cs="Calibri" w:eastAsia="Calibri" w:hAnsi="Calibri"/>
+                <w:b/>
+                <w:bCs/>
+                <w:sz w:val="20"/>
+                <w:szCs w:val="20"/>
+              </w:rPr>
+              <w:t xml:space="preserve">3</w:t>
+            </w:r>
+          </w:p>
+        </w:tc>
+        <w:tc>
+          <w:tcPr>
+            <w:tcW w:type="dxa" w:w="2800"/>
+            <w:tcMar>
+              <w:top w:type="dxa" w:w="70"/>
+              <w:left w:type="dxa" w:w="110"/>
+              <w:bottom w:type="dxa" w:w="70"/>
+              <w:right w:type="dxa" w:w="110"/>
+            </w:tcMar>
+          </w:tcPr>
+          <w:p>
+            <w:pPr>
+              <w:keepNext/>
+              <w:spacing w:after="0" w:line="250"/>
+            </w:pPr>
+            <w:r>
+              <w:rPr>
+                <w:rFonts w:ascii="Calibri" w:cs="Calibri" w:eastAsia="Calibri" w:hAnsi="Calibri"/>
+                <w:b w:val="false"/>
+                <w:bCs w:val="false"/>
+                <w:sz w:val="20"/>
+                <w:szCs w:val="20"/>
+              </w:rPr>
+              <w:t xml:space="preserve">Implemented leave management</w:t>
+            </w:r>
+          </w:p>
+        </w:tc>
+        <w:tc>
+          <w:tcPr>
+            <w:tcW w:type="dxa" w:w="6250"/>
+            <w:tcMar>
+              <w:top w:type="dxa" w:w="70"/>
+              <w:left w:type="dxa" w:w="110"/>
+              <w:bottom w:type="dxa" w:w="70"/>
+              <w:right w:type="dxa" w:w="110"/>
+            </w:tcMar>
+          </w:tcPr>
+          <w:p>
+            <w:pPr>
+              <w:keepNext/>
+              <w:spacing w:after="0" w:line="250"/>
+            </w:pPr>
+            <w:r>
+              <w:rPr>
+                <w:rFonts w:ascii="Calibri" w:cs="Calibri" w:eastAsia="Calibri" w:hAnsi="Calibri"/>
+                <w:b w:val="false"/>
+                <w:bCs w:val="false"/>
+                <w:sz w:val="20"/>
+                <w:szCs w:val="20"/>
+              </w:rPr>
+              <w:t xml:space="preserve">applyLeave(), cancelLeave() and checkLeaveBalance(), tested with valid and invalid requests</w:t>
+            </w:r>
+          </w:p>
+        </w:tc>
+      </w:tr>
+      <w:tr>
+        <w:trPr>
+          <w:cantSplit/>
+        </w:trPr>
+        <w:tc>
+          <w:tcPr>
+            <w:tcW w:type="dxa" w:w="450"/>
+            <w:tcMar>
+              <w:top w:type="dxa" w:w="70"/>
+              <w:left w:type="dxa" w:w="110"/>
+              <w:bottom w:type="dxa" w:w="70"/>
+              <w:right w:type="dxa" w:w="110"/>
+            </w:tcMar>
+          </w:tcPr>
+          <w:p>
+            <w:pPr>
+              <w:keepNext/>
+              <w:spacing w:after="0" w:line="250"/>
+            </w:pPr>
+            <w:r>
+              <w:rPr>
+                <w:rFonts w:ascii="Calibri" w:cs="Calibri" w:eastAsia="Calibri" w:hAnsi="Calibri"/>
+                <w:b/>
+                <w:bCs/>
+                <w:sz w:val="20"/>
+                <w:szCs w:val="20"/>
+              </w:rPr>
+              <w:t xml:space="preserve">4</w:t>
+            </w:r>
+          </w:p>
+        </w:tc>
+        <w:tc>
+          <w:tcPr>
+            <w:tcW w:type="dxa" w:w="2800"/>
+            <w:tcMar>
+              <w:top w:type="dxa" w:w="70"/>
+              <w:left w:type="dxa" w:w="110"/>
+              <w:bottom w:type="dxa" w:w="70"/>
+              <w:right w:type="dxa" w:w="110"/>
+            </w:tcMar>
+          </w:tcPr>
+          <w:p>
+            <w:pPr>
+              <w:keepNext/>
+              <w:spacing w:after="0" w:line="250"/>
+            </w:pPr>
+            <w:r>
+              <w:rPr>
+                <w:rFonts w:ascii="Calibri" w:cs="Calibri" w:eastAsia="Calibri" w:hAnsi="Calibri"/>
+                <w:b w:val="false"/>
+                <w:bCs w:val="false"/>
+                <w:sz w:val="20"/>
+                <w:szCs w:val="20"/>
+              </w:rPr>
+              <w:t xml:space="preserve">Added inheritance</w:t>
+            </w:r>
+          </w:p>
+        </w:tc>
+        <w:tc>
+          <w:tcPr>
+            <w:tcW w:type="dxa" w:w="6250"/>
+            <w:tcMar>
+              <w:top w:type="dxa" w:w="70"/>
+              <w:left w:type="dxa" w:w="110"/>
+              <w:bottom w:type="dxa" w:w="70"/>
+              <w:right w:type="dxa" w:w="110"/>
+            </w:tcMar>
+          </w:tcPr>
+          <w:p>
+            <w:pPr>
+              <w:keepNext/>
+              <w:spacing w:after="0" w:line="250"/>
+            </w:pPr>
+            <w:r>
+              <w:rPr>
+                <w:rFonts w:ascii="Calibri" w:cs="Calibri" w:eastAsia="Calibri" w:hAnsi="Calibri"/>
+                <w:b w:val="false"/>
+                <w:bCs w:val="false"/>
+                <w:sz w:val="20"/>
+                <w:szCs w:val="20"/>
+              </w:rPr>
+              <w:t xml:space="preserve">Employee made abstract; FullTimeEmployee, PartTimeEmployee and Intern with their own leave rules</w:t>
+            </w:r>
+          </w:p>
+        </w:tc>
+      </w:tr>
+      <w:tr>
+        <w:trPr>
+          <w:cantSplit/>
+        </w:trPr>
+        <w:tc>
+          <w:tcPr>
+            <w:tcW w:type="dxa" w:w="450"/>
+            <w:tcMar>
+              <w:top w:type="dxa" w:w="70"/>
+              <w:left w:type="dxa" w:w="110"/>
+              <w:bottom w:type="dxa" w:w="70"/>
+              <w:right w:type="dxa" w:w="110"/>
+            </w:tcMar>
+          </w:tcPr>
+          <w:p>
+            <w:pPr>
+              <w:keepNext/>
+              <w:spacing w:after="0" w:line="250"/>
+            </w:pPr>
+            <w:r>
+              <w:rPr>
+                <w:rFonts w:ascii="Calibri" w:cs="Calibri" w:eastAsia="Calibri" w:hAnsi="Calibri"/>
+                <w:b/>
+                <w:bCs/>
+                <w:sz w:val="20"/>
+                <w:szCs w:val="20"/>
+              </w:rPr>
+              <w:t xml:space="preserve">5</w:t>
+            </w:r>
+          </w:p>
+        </w:tc>
+        <w:tc>
+          <w:tcPr>
+            <w:tcW w:type="dxa" w:w="2800"/>
+            <w:tcMar>
+              <w:top w:type="dxa" w:w="70"/>
+              <w:left w:type="dxa" w:w="110"/>
+              <w:bottom w:type="dxa" w:w="70"/>
+              <w:right w:type="dxa" w:w="110"/>
+            </w:tcMar>
+          </w:tcPr>
+          <w:p>
+            <w:pPr>
+              <w:keepNext/>
+              <w:spacing w:after="0" w:line="250"/>
+            </w:pPr>
+            <w:r>
+              <w:rPr>
+                <w:rFonts w:ascii="Calibri" w:cs="Calibri" w:eastAsia="Calibri" w:hAnsi="Calibri"/>
+                <w:b w:val="false"/>
+                <w:bCs w:val="false"/>
+                <w:sz w:val="20"/>
+                <w:szCs w:val="20"/>
+              </w:rPr>
+              <w:t xml:space="preserve">Implemented polymorphism</w:t>
+            </w:r>
+          </w:p>
+        </w:tc>
+        <w:tc>
+          <w:tcPr>
+            <w:tcW w:type="dxa" w:w="6250"/>
+            <w:tcMar>
+              <w:top w:type="dxa" w:w="70"/>
+              <w:left w:type="dxa" w:w="110"/>
+              <w:bottom w:type="dxa" w:w="70"/>
+              <w:right w:type="dxa" w:w="110"/>
+            </w:tcMar>
+          </w:tcPr>
+          <w:p>
+            <w:pPr>
+              <w:keepNext/>
+              <w:spacing w:after="0" w:line="250"/>
+            </w:pPr>
+            <w:r>
+              <w:rPr>
+                <w:rFonts w:ascii="Calibri" w:cs="Calibri" w:eastAsia="Calibri" w:hAnsi="Calibri"/>
+                <w:b w:val="false"/>
+                <w:bCs w:val="false"/>
+                <w:sz w:val="20"/>
+                <w:szCs w:val="20"/>
+              </w:rPr>
+              <w:t xml:space="preserve">The app keeps every employee in one Employee array and calls the same methods on each</w:t>
+            </w:r>
+          </w:p>
+        </w:tc>
+      </w:tr>
+      <w:tr>
+        <w:trPr>
+          <w:cantSplit/>
+        </w:trPr>
+        <w:tc>
+          <w:tcPr>
+            <w:tcW w:type="dxa" w:w="450"/>
+            <w:tcMar>
+              <w:top w:type="dxa" w:w="70"/>
+              <w:left w:type="dxa" w:w="110"/>
+              <w:bottom w:type="dxa" w:w="70"/>
+              <w:right w:type="dxa" w:w="110"/>
+            </w:tcMar>
+          </w:tcPr>
+          <w:p>
+            <w:pPr>
+              <w:keepNext/>
+              <w:spacing w:after="0" w:line="250"/>
+            </w:pPr>
+            <w:r>
+              <w:rPr>
+                <w:rFonts w:ascii="Calibri" w:cs="Calibri" w:eastAsia="Calibri" w:hAnsi="Calibri"/>
+                <w:b/>
+                <w:bCs/>
+                <w:sz w:val="20"/>
+                <w:szCs w:val="20"/>
+              </w:rPr>
+              <w:t xml:space="preserve">6</w:t>
+            </w:r>
+          </w:p>
+        </w:tc>
+        <w:tc>
+          <w:tcPr>
+            <w:tcW w:type="dxa" w:w="2800"/>
+            <w:tcMar>
+              <w:top w:type="dxa" w:w="70"/>
+              <w:left w:type="dxa" w:w="110"/>
+              <w:bottom w:type="dxa" w:w="70"/>
+              <w:right w:type="dxa" w:w="110"/>
+            </w:tcMar>
+          </w:tcPr>
+          <w:p>
+            <w:pPr>
+              <w:keepNext/>
+              <w:spacing w:after="0" w:line="250"/>
+            </w:pPr>
+            <w:r>
+              <w:rPr>
+                <w:rFonts w:ascii="Calibri" w:cs="Calibri" w:eastAsia="Calibri" w:hAnsi="Calibri"/>
+                <w:b w:val="false"/>
+                <w:bCs w:val="false"/>
+                <w:sz w:val="20"/>
+                <w:szCs w:val="20"/>
+              </w:rPr>
+              <w:t xml:space="preserve">Added Manager</w:t>
+            </w:r>
+          </w:p>
+        </w:tc>
+        <w:tc>
+          <w:tcPr>
+            <w:tcW w:type="dxa" w:w="6250"/>
+            <w:tcMar>
+              <w:top w:type="dxa" w:w="70"/>
+              <w:left w:type="dxa" w:w="110"/>
+              <w:bottom w:type="dxa" w:w="70"/>
+              <w:right w:type="dxa" w:w="110"/>
+            </w:tcMar>
+          </w:tcPr>
+          <w:p>
+            <w:pPr>
+              <w:keepNext/>
+              <w:spacing w:after="0" w:line="250"/>
+            </w:pPr>
+            <w:r>
+              <w:rPr>
+                <w:rFonts w:ascii="Calibri" w:cs="Calibri" w:eastAsia="Calibri" w:hAnsi="Calibri"/>
+                <w:b w:val="false"/>
+                <w:bCs w:val="false"/>
+                <w:sz w:val="20"/>
+                <w:szCs w:val="20"/>
+              </w:rPr>
+              <w:t xml:space="preserve">The Manager class with additional leave benefits (the change request)</w:t>
+            </w:r>
+          </w:p>
+        </w:tc>
+      </w:tr>
+      <w:tr>
+        <w:trPr>
+          <w:cantSplit/>
+        </w:trPr>
+        <w:tc>
+          <w:tcPr>
+            <w:tcW w:type="dxa" w:w="450"/>
+            <w:tcMar>
+              <w:top w:type="dxa" w:w="70"/>
+              <w:left w:type="dxa" w:w="110"/>
+              <w:bottom w:type="dxa" w:w="70"/>
+              <w:right w:type="dxa" w:w="110"/>
+            </w:tcMar>
+          </w:tcPr>
+          <w:p>
+            <w:pPr>
+              <w:keepNext/>
+              <w:spacing w:after="0" w:line="250"/>
+            </w:pPr>
+            <w:r>
+              <w:rPr>
+                <w:rFonts w:ascii="Calibri" w:cs="Calibri" w:eastAsia="Calibri" w:hAnsi="Calibri"/>
+                <w:b/>
+                <w:bCs/>
+                <w:sz w:val="20"/>
+                <w:szCs w:val="20"/>
+              </w:rPr>
+              <w:t xml:space="preserve">7</w:t>
+            </w:r>
+          </w:p>
+        </w:tc>
+        <w:tc>
+          <w:tcPr>
+            <w:tcW w:type="dxa" w:w="2800"/>
+            <w:tcMar>
+              <w:top w:type="dxa" w:w="70"/>
+              <w:left w:type="dxa" w:w="110"/>
+              <w:bottom w:type="dxa" w:w="70"/>
+              <w:right w:type="dxa" w:w="110"/>
+            </w:tcMar>
+          </w:tcPr>
+          <w:p>
+            <w:pPr>
+              <w:keepNext/>
+              <w:spacing w:after="0" w:line="250"/>
+            </w:pPr>
+            <w:r>
+              <w:rPr>
+                <w:rFonts w:ascii="Calibri" w:cs="Calibri" w:eastAsia="Calibri" w:hAnsi="Calibri"/>
+                <w:b w:val="false"/>
+                <w:bCs w:val="false"/>
+                <w:sz w:val="20"/>
+                <w:szCs w:val="20"/>
+              </w:rPr>
+              <w:t xml:space="preserve">Refactored code</w:t>
+            </w:r>
+          </w:p>
+        </w:tc>
+        <w:tc>
+          <w:tcPr>
+            <w:tcW w:type="dxa" w:w="6250"/>
+            <w:tcMar>
+              <w:top w:type="dxa" w:w="70"/>
+              <w:left w:type="dxa" w:w="110"/>
+              <w:bottom w:type="dxa" w:w="70"/>
+              <w:right w:type="dxa" w:w="110"/>
+            </w:tcMar>
+          </w:tcPr>
+          <w:p>
+            <w:pPr>
+              <w:keepNext/>
+              <w:spacing w:after="0" w:line="250"/>
+            </w:pPr>
+            <w:r>
+              <w:rPr>
+                <w:rFonts w:ascii="Calibri" w:cs="Calibri" w:eastAsia="Calibri" w:hAnsi="Calibri"/>
+                <w:b w:val="false"/>
+                <w:bCs w:val="false"/>
+                <w:sz w:val="20"/>
+                <w:szCs w:val="20"/>
+              </w:rPr>
+              <w:t xml:space="preserve">The six improvements described in Section 7: shared validation, custom exceptions, constants and more</w:t>
+            </w:r>
+          </w:p>
+        </w:tc>
+      </w:tr>
+      <w:tr>
+        <w:trPr>
+          <w:cantSplit/>
+        </w:trPr>
+        <w:tc>
+          <w:tcPr>
+            <w:tcW w:type="dxa" w:w="450"/>
+            <w:tcMar>
+              <w:top w:type="dxa" w:w="70"/>
+              <w:left w:type="dxa" w:w="110"/>
+              <w:bottom w:type="dxa" w:w="70"/>
+              <w:right w:type="dxa" w:w="110"/>
+            </w:tcMar>
+          </w:tcPr>
+          <w:p>
+            <w:pPr>
+              <w:keepNext w:val="false"/>
+              <w:spacing w:after="0" w:line="250"/>
+            </w:pPr>
+            <w:r>
+              <w:rPr>
+                <w:rFonts w:ascii="Calibri" w:cs="Calibri" w:eastAsia="Calibri" w:hAnsi="Calibri"/>
+                <w:b/>
+                <w:bCs/>
+                <w:sz w:val="20"/>
+                <w:szCs w:val="20"/>
+              </w:rPr>
+              <w:t xml:space="preserve">8</w:t>
+            </w:r>
+          </w:p>
+        </w:tc>
+        <w:tc>
+          <w:tcPr>
+            <w:tcW w:type="dxa" w:w="2800"/>
+            <w:tcMar>
+              <w:top w:type="dxa" w:w="70"/>
+              <w:left w:type="dxa" w:w="110"/>
+              <w:bottom w:type="dxa" w:w="70"/>
+              <w:right w:type="dxa" w:w="110"/>
+            </w:tcMar>
+          </w:tcPr>
+          <w:p>
+            <w:pPr>
+              <w:keepNext w:val="false"/>
+              <w:spacing w:after="0" w:line="250"/>
+            </w:pPr>
+            <w:r>
+              <w:rPr>
+                <w:rFonts w:ascii="Calibri" w:cs="Calibri" w:eastAsia="Calibri" w:hAnsi="Calibri"/>
+                <w:b w:val="false"/>
+                <w:bCs w:val="false"/>
+                <w:sz w:val="20"/>
+                <w:szCs w:val="20"/>
+              </w:rPr>
+              <w:t xml:space="preserve">Final version</w:t>
+            </w:r>
+          </w:p>
+        </w:tc>
+        <w:tc>
+          <w:tcPr>
+            <w:tcW w:type="dxa" w:w="6250"/>
+            <w:tcMar>
+              <w:top w:type="dxa" w:w="70"/>
+              <w:left w:type="dxa" w:w="110"/>
+              <w:bottom w:type="dxa" w:w="70"/>
+              <w:right w:type="dxa" w:w="110"/>
+            </w:tcMar>
+          </w:tcPr>
+          <w:p>
+            <w:pPr>
+              <w:keepNext w:val="false"/>
+              <w:spacing w:after="0" w:line="250"/>
+            </w:pPr>
+            <w:r>
+              <w:rPr>
+                <w:rFonts w:ascii="Calibri" w:cs="Calibri" w:eastAsia="Calibri" w:hAnsi="Calibri"/>
+                <w:b w:val="false"/>
+                <w:bCs w:val="false"/>
+                <w:sz w:val="20"/>
+                <w:szCs w:val="20"/>
+              </w:rPr>
+              <w:t xml:space="preserve">README, final class diagram, screenshots and this report</w:t>
+            </w:r>
+          </w:p>
+        </w:tc>
+      </w:tr>
+    </w:tbl>
+    <w:p>
+      <w:pPr>
+        <w:spacing w:after="120"/>
+      </w:pPr>
+    </w:p>
+    <w:p>
+      <w:pPr>
+        <w:spacing w:after="150" w:line="276"/>
+      </w:pPr>
+      <w:r>
+        <w:rPr>
+          <w:rFonts w:ascii="Calibri" w:cs="Calibri" w:eastAsia="Calibri" w:hAnsi="Calibri"/>
+          <w:sz w:val="22"/>
+          <w:szCs w:val="22"/>
+        </w:rPr>
+        <w:t xml:space="preserve">The history can be viewed on GitHub under Commits, or in a terminal with the command git log --oneline.</w:t>
+      </w:r>
+    </w:p>
+    <w:p>
       <w:r>
         <w:br w:type="page"/>
       </w:r>

</xml_diff>